<commit_message>
feat: Add result files management, debug mode, progress tracking
- Add /api/v1/results/:id/files endpoints for file management
- Add POST /api/v1/results/:id/debug for debug mode execution
- Add progress.json tracking with step/analysis elapsed time
- Add workflow resolution: string, array, or .workflow file name
- Support # comments in workflow (ignored during execution)
- Add .sh shell script support
- Refactor shared file-manager utility module
- Update API.md documentation
</commit_message>
<xml_diff>
--- a/scripts/reports/templateM.docx
+++ b/scripts/reports/templateM.docx
@@ -9,6 +9,7 @@
           <w:ilvl w:val="0"/>
           <w:numId w:val="0"/>
         </w:numPr>
+        <w:ind w:hanging="0" w:left="0"/>
         <w:outlineLvl w:val="0"/>
         <w:rPr>
           <w:b/>
@@ -30,6 +31,7 @@
           <w:numId w:val="0"/>
         </w:numPr>
         <w:spacing w:before="120" w:after="0"/>
+        <w:ind w:hanging="0" w:left="0"/>
         <w:outlineLvl w:val="0"/>
         <w:rPr>
           <w:rFonts w:ascii="3 of 9 Barcode" w:hAnsi="3 of 9 Barcode"/>
@@ -101,6 +103,7 @@
           <w:ilvl w:val="0"/>
           <w:numId w:val="0"/>
         </w:numPr>
+        <w:ind w:hanging="0" w:left="0"/>
         <w:outlineLvl w:val="0"/>
         <w:rPr/>
       </w:pPr>
@@ -132,12 +135,19 @@
           <w:ilvl w:val="0"/>
           <w:numId w:val="0"/>
         </w:numPr>
+        <w:ind w:hanging="0" w:left="0"/>
         <w:outlineLvl w:val="0"/>
-        <w:rPr/>
-      </w:pPr>
-      <w:r>
-        <w:rPr/>
-        <w:t>Manažerský report</w:t>
+        <w:rPr>
+          <w:u w:val="double"/>
+        </w:rPr>
+      </w:pPr>
+      <w:r>
+        <w:rPr/>
+        <w:t xml:space="preserve">Manažerský report </w:t>
+      </w:r>
+      <w:r>
+        <w:rPr/>
+        <w:t>2</w:t>
       </w:r>
     </w:p>
     <w:tbl>
@@ -155,9 +165,9 @@
         <w:tblLook w:val="01e0" w:noHBand="0" w:noVBand="0" w:firstColumn="1" w:lastRow="1" w:lastColumn="1" w:firstRow="1"/>
       </w:tblPr>
       <w:tblGrid>
-        <w:gridCol w:w="5300"/>
+        <w:gridCol w:w="5297"/>
         <w:gridCol w:w="2290"/>
-        <w:gridCol w:w="2048"/>
+        <w:gridCol w:w="2051"/>
       </w:tblGrid>
       <w:tr>
         <w:trPr>
@@ -165,7 +175,7 @@
         </w:trPr>
         <w:tc>
           <w:tcPr>
-            <w:tcW w:w="5300" w:type="dxa"/>
+            <w:tcW w:w="5297" w:type="dxa"/>
             <w:tcBorders/>
           </w:tcPr>
           <w:p>
@@ -234,7 +244,7 @@
         </w:tc>
         <w:tc>
           <w:tcPr>
-            <w:tcW w:w="2048" w:type="dxa"/>
+            <w:tcW w:w="2051" w:type="dxa"/>
             <w:tcBorders/>
           </w:tcPr>
           <w:p>
@@ -252,7 +262,7 @@
         <w:trPr/>
         <w:tc>
           <w:tcPr>
-            <w:tcW w:w="5300" w:type="dxa"/>
+            <w:tcW w:w="5297" w:type="dxa"/>
             <w:tcBorders/>
           </w:tcPr>
           <w:p>
@@ -331,7 +341,7 @@
         </w:tc>
         <w:tc>
           <w:tcPr>
-            <w:tcW w:w="2048" w:type="dxa"/>
+            <w:tcW w:w="2051" w:type="dxa"/>
             <w:tcBorders/>
           </w:tcPr>
           <w:p>
@@ -467,7 +477,7 @@
           <w:bCs/>
           <w:shd w:fill="auto" w:val="clear"/>
         </w:rPr>
-        <w:t>[[processedAtDMY]]</w:t>
+        <w:t>[[processedAt{„format“:“d. LLL yyyy“}]]</w:t>
       </w:r>
       <w:r>
         <w:rPr>
@@ -719,8 +729,8 @@
         <w:pStyle w:val="Normal"/>
         <w:rPr/>
       </w:pPr>
-      <w:bookmarkStart w:id="1" w:name="Text10"/>
-      <w:bookmarkStart w:id="2" w:name="Text12"/>
+      <w:bookmarkStart w:id="1" w:name="Text12"/>
+      <w:bookmarkStart w:id="2" w:name="Text10"/>
       <w:r>
         <w:rPr/>
         <w:t xml:space="preserve">Jméno Příjmení </w:t>
@@ -735,7 +745,6 @@
       </w:pPr>
       <w:r>
         <w:rPr/>
-        <w:t>Pracovní pozice</w:t>
       </w:r>
     </w:p>
     <w:p>
@@ -943,7 +952,12 @@
         </w:rPr>
       </w:pPr>
       <w:r>
-        <w:rPr/>
+        <w:rPr>
+          <w:rFonts w:cs="Calibri" w:cstheme="minorHAnsi"/>
+          <w:b/>
+          <w:bCs/>
+          <w:szCs w:val="24"/>
+        </w:rPr>
       </w:r>
     </w:p>
     <w:p>
@@ -984,15 +998,15 @@
         <w:tblLook w:val="04a0" w:noHBand="0" w:noVBand="1" w:firstColumn="1" w:lastRow="0" w:lastColumn="0" w:firstRow="1"/>
       </w:tblPr>
       <w:tblGrid>
-        <w:gridCol w:w="3885"/>
-        <w:gridCol w:w="2970"/>
+        <w:gridCol w:w="3882"/>
+        <w:gridCol w:w="2973"/>
         <w:gridCol w:w="2923"/>
       </w:tblGrid>
       <w:tr>
         <w:trPr/>
         <w:tc>
           <w:tcPr>
-            <w:tcW w:w="3885" w:type="dxa"/>
+            <w:tcW w:w="3882" w:type="dxa"/>
             <w:tcBorders>
               <w:top w:val="single" w:sz="2" w:space="0" w:color="000000"/>
               <w:left w:val="single" w:sz="2" w:space="0" w:color="000000"/>
@@ -1030,7 +1044,7 @@
         </w:tc>
         <w:tc>
           <w:tcPr>
-            <w:tcW w:w="2970" w:type="dxa"/>
+            <w:tcW w:w="2973" w:type="dxa"/>
             <w:tcBorders>
               <w:top w:val="single" w:sz="2" w:space="0" w:color="000000"/>
               <w:left w:val="single" w:sz="2" w:space="0" w:color="000000"/>
@@ -1124,7 +1138,7 @@
         <w:trPr/>
         <w:tc>
           <w:tcPr>
-            <w:tcW w:w="3885" w:type="dxa"/>
+            <w:tcW w:w="3882" w:type="dxa"/>
             <w:tcBorders>
               <w:top w:val="nil"/>
               <w:left w:val="single" w:sz="2" w:space="0" w:color="000000"/>
@@ -1150,40 +1164,13 @@
                 <w:szCs w:val="24"/>
                 <w:lang w:val="cs-CZ" w:eastAsia="cs-CZ" w:bidi="ar-SA"/>
               </w:rPr>
-              <w:t>[[</w:t>
-            </w:r>
-            <w:r>
-              <w:rPr>
-                <w:rFonts w:eastAsia="Times New Roman" w:cs="Calibri" w:cstheme="minorHAnsi"/>
-                <w:kern w:val="0"/>
-                <w:szCs w:val="24"/>
-                <w:lang w:val="cs-CZ" w:eastAsia="cs-CZ" w:bidi="ar-SA"/>
-              </w:rPr>
-              <w:t>#brands</w:t>
-            </w:r>
-            <w:r>
-              <w:rPr>
-                <w:rFonts w:eastAsia="Times New Roman" w:cs="Calibri" w:cstheme="minorHAnsi"/>
-                <w:kern w:val="0"/>
-                <w:szCs w:val="24"/>
-                <w:lang w:val="cs-CZ" w:eastAsia="cs-CZ" w:bidi="ar-SA"/>
-              </w:rPr>
-              <w:t>]]</w:t>
-            </w:r>
-            <w:r>
-              <w:rPr>
-                <w:rFonts w:eastAsia="Times New Roman" w:cs="Calibri" w:cstheme="minorHAnsi"/>
-                <w:kern w:val="0"/>
-                <w:szCs w:val="24"/>
-                <w:lang w:val="cs-CZ" w:eastAsia="cs-CZ" w:bidi="ar-SA"/>
-              </w:rPr>
-              <w:t>[[brand]]</w:t>
+              <w:t>[[#brands]][[brand]]</w:t>
             </w:r>
           </w:p>
         </w:tc>
         <w:tc>
           <w:tcPr>
-            <w:tcW w:w="2970" w:type="dxa"/>
+            <w:tcW w:w="2973" w:type="dxa"/>
             <w:tcBorders>
               <w:top w:val="nil"/>
               <w:left w:val="single" w:sz="2" w:space="0" w:color="000000"/>
@@ -2051,7 +2038,7 @@
       </w:tblPr>
       <w:tblGrid>
         <w:gridCol w:w="4888"/>
-        <w:gridCol w:w="4890"/>
+        <w:gridCol w:w="4889"/>
       </w:tblGrid>
       <w:tr>
         <w:trPr/>
@@ -2096,7 +2083,7 @@
         </w:tc>
         <w:tc>
           <w:tcPr>
-            <w:tcW w:w="4890" w:type="dxa"/>
+            <w:tcW w:w="4889" w:type="dxa"/>
             <w:tcBorders>
               <w:top w:val="single" w:sz="2" w:space="0" w:color="000000"/>
               <w:left w:val="single" w:sz="2" w:space="0" w:color="000000"/>
@@ -2164,40 +2151,13 @@
                 <w:szCs w:val="24"/>
                 <w:lang w:val="cs-CZ" w:eastAsia="cs-CZ" w:bidi="ar-SA"/>
               </w:rPr>
-              <w:t>[[</w:t>
-            </w:r>
-            <w:r>
-              <w:rPr>
-                <w:rFonts w:eastAsia="Times New Roman" w:cs="Calibri" w:cstheme="minorHAnsi"/>
-                <w:kern w:val="0"/>
-                <w:szCs w:val="24"/>
-                <w:lang w:val="cs-CZ" w:eastAsia="cs-CZ" w:bidi="ar-SA"/>
-              </w:rPr>
-              <w:t>#brands</w:t>
-            </w:r>
-            <w:r>
-              <w:rPr>
-                <w:rFonts w:eastAsia="Times New Roman" w:cs="Calibri" w:cstheme="minorHAnsi"/>
-                <w:kern w:val="0"/>
-                <w:szCs w:val="24"/>
-                <w:lang w:val="cs-CZ" w:eastAsia="cs-CZ" w:bidi="ar-SA"/>
-              </w:rPr>
-              <w:t>]]</w:t>
-            </w:r>
-            <w:r>
-              <w:rPr>
-                <w:rFonts w:eastAsia="Times New Roman" w:cs="Calibri" w:cstheme="minorHAnsi"/>
-                <w:kern w:val="0"/>
-                <w:szCs w:val="24"/>
-                <w:lang w:val="cs-CZ" w:eastAsia="cs-CZ" w:bidi="ar-SA"/>
-              </w:rPr>
-              <w:t>[[brand]]</w:t>
+              <w:t>[[#brands]][[brand]]</w:t>
             </w:r>
           </w:p>
         </w:tc>
         <w:tc>
           <w:tcPr>
-            <w:tcW w:w="4890" w:type="dxa"/>
+            <w:tcW w:w="4889" w:type="dxa"/>
             <w:tcBorders>
               <w:top w:val="nil"/>
               <w:left w:val="single" w:sz="2" w:space="0" w:color="000000"/>
@@ -2261,7 +2221,10 @@
         </w:rPr>
       </w:pPr>
       <w:r>
-        <w:rPr/>
+        <w:rPr>
+          <w:b/>
+          <w:bCs/>
+        </w:rPr>
       </w:r>
     </w:p>
     <w:p>
@@ -2330,7 +2293,7 @@
   <w:comment w:id="0" w:author="Machay Martin" w:date="2025-09-30T12:50:00Z" w:initials="MM">
     <w:p>
       <w:pPr>
-        <w:overflowPunct w:val="false"/>
+        <w:overflowPunct w:val="true"/>
         <w:jc w:val="left"/>
         <w:rPr/>
       </w:pPr>
@@ -2347,7 +2310,7 @@
   <w:comment w:id="1" w:author="Machay Martin" w:date="2025-10-02T14:19:00Z" w:initials="MM">
     <w:p>
       <w:pPr>
-        <w:overflowPunct w:val="false"/>
+        <w:overflowPunct w:val="true"/>
         <w:jc w:val="left"/>
         <w:rPr/>
       </w:pPr>
@@ -4621,16 +4584,18 @@
       <w:szCs w:val="24"/>
     </w:rPr>
   </w:style>
+  <w:style w:type="character" w:styleId="EndnoteCharacters">
+    <w:name w:val="Endnote Characters"/>
+    <w:qFormat/>
+    <w:rPr>
+      <w:vertAlign w:val="superscript"/>
+    </w:rPr>
+  </w:style>
   <w:style w:type="character" w:styleId="EndnoteReference">
     <w:name w:val="Endnote Reference"/>
     <w:rPr>
       <w:vertAlign w:val="superscript"/>
     </w:rPr>
-  </w:style>
-  <w:style w:type="character" w:styleId="EndnoteCharacters">
-    <w:name w:val="Endnote Characters"/>
-    <w:qFormat/>
-    <w:rPr/>
   </w:style>
   <w:style w:type="paragraph" w:styleId="Heading" w:customStyle="1">
     <w:name w:val="Heading"/>

</xml_diff>

<commit_message>
Translate documentation and code comments to English
- Translated all .md files to English (API.md, EMAIL_TESTING.md, HEALTH_CHECK.md, IMPORT_API.md, MANUAL_IMPORT.md, MIGRATION.md, PYTHON_SETUP.md, SCRIPTS_API.md)
- Updated README.md with English text
- Translated Czech comments in source code (index.js, db.js, config.js)
</commit_message>
<xml_diff>
--- a/scripts/reports/templateM.docx
+++ b/scripts/reports/templateM.docx
@@ -143,11 +143,7 @@
       </w:pPr>
       <w:r>
         <w:rPr/>
-        <w:t xml:space="preserve">Manažerský report </w:t>
-      </w:r>
-      <w:r>
-        <w:rPr/>
-        <w:t>2</w:t>
+        <w:t>Manažerský report</w:t>
       </w:r>
     </w:p>
     <w:tbl>
@@ -729,8 +725,8 @@
         <w:pStyle w:val="Normal"/>
         <w:rPr/>
       </w:pPr>
-      <w:bookmarkStart w:id="1" w:name="Text12"/>
-      <w:bookmarkStart w:id="2" w:name="Text10"/>
+      <w:bookmarkStart w:id="1" w:name="Text10"/>
+      <w:bookmarkStart w:id="2" w:name="Text12"/>
       <w:r>
         <w:rPr/>
         <w:t xml:space="preserve">Jméno Příjmení </w:t>
@@ -998,15 +994,15 @@
         <w:tblLook w:val="04a0" w:noHBand="0" w:noVBand="1" w:firstColumn="1" w:lastRow="0" w:lastColumn="0" w:firstRow="1"/>
       </w:tblPr>
       <w:tblGrid>
-        <w:gridCol w:w="3882"/>
-        <w:gridCol w:w="2973"/>
+        <w:gridCol w:w="3881"/>
+        <w:gridCol w:w="2974"/>
         <w:gridCol w:w="2923"/>
       </w:tblGrid>
       <w:tr>
         <w:trPr/>
         <w:tc>
           <w:tcPr>
-            <w:tcW w:w="3882" w:type="dxa"/>
+            <w:tcW w:w="3881" w:type="dxa"/>
             <w:tcBorders>
               <w:top w:val="single" w:sz="2" w:space="0" w:color="000000"/>
               <w:left w:val="single" w:sz="2" w:space="0" w:color="000000"/>
@@ -1044,7 +1040,7 @@
         </w:tc>
         <w:tc>
           <w:tcPr>
-            <w:tcW w:w="2973" w:type="dxa"/>
+            <w:tcW w:w="2974" w:type="dxa"/>
             <w:tcBorders>
               <w:top w:val="single" w:sz="2" w:space="0" w:color="000000"/>
               <w:left w:val="single" w:sz="2" w:space="0" w:color="000000"/>
@@ -1138,7 +1134,7 @@
         <w:trPr/>
         <w:tc>
           <w:tcPr>
-            <w:tcW w:w="3882" w:type="dxa"/>
+            <w:tcW w:w="3881" w:type="dxa"/>
             <w:tcBorders>
               <w:top w:val="nil"/>
               <w:left w:val="single" w:sz="2" w:space="0" w:color="000000"/>
@@ -1170,7 +1166,7 @@
         </w:tc>
         <w:tc>
           <w:tcPr>
-            <w:tcW w:w="2973" w:type="dxa"/>
+            <w:tcW w:w="2974" w:type="dxa"/>
             <w:tcBorders>
               <w:top w:val="nil"/>
               <w:left w:val="single" w:sz="2" w:space="0" w:color="000000"/>
@@ -2293,7 +2289,7 @@
   <w:comment w:id="0" w:author="Machay Martin" w:date="2025-09-30T12:50:00Z" w:initials="MM">
     <w:p>
       <w:pPr>
-        <w:overflowPunct w:val="true"/>
+        <w:overflowPunct w:val="false"/>
         <w:jc w:val="left"/>
         <w:rPr/>
       </w:pPr>
@@ -2310,7 +2306,7 @@
   <w:comment w:id="1" w:author="Machay Martin" w:date="2025-10-02T14:19:00Z" w:initials="MM">
     <w:p>
       <w:pPr>
-        <w:overflowPunct w:val="true"/>
+        <w:overflowPunct w:val="false"/>
         <w:jc w:val="left"/>
         <w:rPr/>
       </w:pPr>

</xml_diff>